<commit_message>
docs(entrega): publicar DOCX/PDF v1.1 e modelo físico v1.40
</commit_message>
<xml_diff>
--- a/Documentos/Anexo_Modelo_Fisico_Jornada_v1.40.docx
+++ b/Documentos/Anexo_Modelo_Fisico_Jornada_v1.40.docx
@@ -144,14 +144,14 @@
       <w:r>
         <w:drawing>
           <wp:inline>
-            <wp:extent cx="5939999" cy="2763014"/>
+            <wp:extent cx="8412480" cy="5013579"/>
             <wp:effectExtent b="0" l="0" r="0" t="0"/>
             <wp:docPr descr="Figura 1 - Diagrama de classes UML da estrutura de Identidade/Linkage" title="" id="21" name="Picture"/>
             <a:graphic>
               <a:graphicData uri="http://schemas.openxmlformats.org/drawingml/2006/picture">
                 <pic:pic>
                   <pic:nvPicPr>
-                    <pic:cNvPr descr="Jornada_Identidade_Linkage_Classes.png" id="22" name="Picture"/>
+                    <pic:cNvPr descr="uml/Jornada_Identidade_Linkage_Classes.png" id="22" name="Picture"/>
                     <pic:cNvPicPr>
                       <a:picLocks noChangeArrowheads="1" noChangeAspect="1"/>
                     </pic:cNvPicPr>
@@ -165,7 +165,7 @@
                   <pic:spPr bwMode="auto">
                     <a:xfrm>
                       <a:off x="0" y="0"/>
-                      <a:ext cx="5939999" cy="2763014"/>
+                      <a:ext cx="8412480" cy="5013579"/>
                     </a:xfrm>
                     <a:prstGeom prst="rect">
                       <a:avLst/>
@@ -199,14 +199,14 @@
       <w:r>
         <w:drawing>
           <wp:inline>
-            <wp:extent cx="5399999" cy="4345395"/>
+            <wp:extent cx="8229600" cy="5162668"/>
             <wp:effectExtent b="0" l="0" r="0" t="0"/>
             <wp:docPr descr="Figura 2 - Diagrama de atividade UML da resolução de identidade" title="" id="24" name="Picture"/>
             <a:graphic>
               <a:graphicData uri="http://schemas.openxmlformats.org/drawingml/2006/picture">
                 <pic:pic>
                   <pic:nvPicPr>
-                    <pic:cNvPr descr="Jornada_Resolucao_Identidade_Atividade.png" id="25" name="Picture"/>
+                    <pic:cNvPr descr="uml/Jornada_Resolucao_Identidade_Atividade.png" id="25" name="Picture"/>
                     <pic:cNvPicPr>
                       <a:picLocks noChangeArrowheads="1" noChangeAspect="1"/>
                     </pic:cNvPicPr>
@@ -220,7 +220,7 @@
                   <pic:spPr bwMode="auto">
                     <a:xfrm>
                       <a:off x="0" y="0"/>
-                      <a:ext cx="5399999" cy="4345395"/>
+                      <a:ext cx="8229600" cy="5162668"/>
                     </a:xfrm>
                     <a:prstGeom prst="rect">
                       <a:avLst/>
@@ -2023,14 +2023,9 @@
     <w:bookmarkEnd w:id="41"/>
     <w:bookmarkEnd w:id="42"/>
     <w:sectPr>
-      <w:footerReference r:id="rId12" w:type="default"/>
-      <w:headerReference r:id="rId9" w:type="default"/>
-      <w:headerReference r:id="rId10" w:type="first"/>
-      <w:footerReference r:id="rId13" w:type="first"/>
-      <w:headerReference r:id="rId11" w:type="even"/>
-      <w:footerReference r:id="rId14" w:type="even"/>
-      <w:pgSz w:h="12240" w:orient="landscape" w:w="15840"/>
-      <w:pgMar w:bottom="936" w:footer="720" w:gutter="0" w:header="720" w:left="1008" w:right="1008" w:top="936"/>
+      <w:footerReference r:id="rId9" w:type="default"/>
+      <w:pgSz w:h="11906" w:orient="landscape" w:w="16838"/>
+      <w:pgMar w:bottom="1020" w:footer="720" w:gutter="0" w:header="720" w:left="1020" w:right="1020" w:top="1020"/>
       <w:cols w:space="720"/>
       <w:docGrid w:linePitch="360"/>
     </w:sectPr>
@@ -2050,33 +2045,9 @@
       <w:jc w:val="center"/>
     </w:pPr>
     <w:r>
-      <w:t xml:space="preserve">Jornada do Cidadão  •  Página </w:t>
+      <w:t xml:space="preserve">Página </w:t>
     </w:r>
-    <w:fldSimple w:instr="PAGE">
-      <w:r>
-        <w:t>1</w:t>
-      </w:r>
-    </w:fldSimple>
-  </w:p>
-</w:ftr>
-</file>
-
-<file path=word/footer2.xml><?xml version="1.0" encoding="utf-8"?>
-<w:ftr xmlns:m="http://schemas.openxmlformats.org/officeDocument/2006/math" xmlns:mc="http://schemas.openxmlformats.org/markup-compatibility/2006" xmlns:mo="http://schemas.microsoft.com/office/mac/office/2008/main" xmlns:mv="urn:schemas-microsoft-com:mac:vml" xmlns:o="urn:schemas-microsoft-com:office:office" xmlns:r="http://schemas.openxmlformats.org/officeDocument/2006/relationships" xmlns:v="urn:schemas-microsoft-com:vml" xmlns:w10="urn:schemas-microsoft-com:office:word" xmlns:w14="http://schemas.microsoft.com/office/word/2010/wordml" xmlns:w="http://schemas.openxmlformats.org/wordprocessingml/2006/main" xmlns:wne="http://schemas.microsoft.com/office/word/2006/wordml" xmlns:wp14="http://schemas.microsoft.com/office/word/2010/wordprocessingDrawing" xmlns:wp="http://schemas.openxmlformats.org/drawingml/2006/wordprocessingDrawing" xmlns:wpc="http://schemas.microsoft.com/office/word/2010/wordprocessingCanvas" xmlns:wpg="http://schemas.microsoft.com/office/word/2010/wordprocessingGroup" xmlns:wpi="http://schemas.microsoft.com/office/word/2010/wordprocessingInk" xmlns:wps="http://schemas.microsoft.com/office/word/2010/wordprocessingShape" mc:Ignorable="w14 wp14">
-  <w:p>
-    <w:pPr>
-      <w:pStyle w:val="Footer"/>
-    </w:pPr>
-  </w:p>
-</w:ftr>
-</file>
-
-<file path=word/footer3.xml><?xml version="1.0" encoding="utf-8"?>
-<w:ftr xmlns:m="http://schemas.openxmlformats.org/officeDocument/2006/math" xmlns:mc="http://schemas.openxmlformats.org/markup-compatibility/2006" xmlns:mo="http://schemas.microsoft.com/office/mac/office/2008/main" xmlns:mv="urn:schemas-microsoft-com:mac:vml" xmlns:o="urn:schemas-microsoft-com:office:office" xmlns:r="http://schemas.openxmlformats.org/officeDocument/2006/relationships" xmlns:v="urn:schemas-microsoft-com:vml" xmlns:w10="urn:schemas-microsoft-com:office:word" xmlns:w14="http://schemas.microsoft.com/office/word/2010/wordml" xmlns:w="http://schemas.openxmlformats.org/wordprocessingml/2006/main" xmlns:wne="http://schemas.microsoft.com/office/word/2006/wordml" xmlns:wp14="http://schemas.microsoft.com/office/word/2010/wordprocessingDrawing" xmlns:wp="http://schemas.openxmlformats.org/drawingml/2006/wordprocessingDrawing" xmlns:wpc="http://schemas.microsoft.com/office/word/2010/wordprocessingCanvas" xmlns:wpg="http://schemas.microsoft.com/office/word/2010/wordprocessingGroup" xmlns:wpi="http://schemas.microsoft.com/office/word/2010/wordprocessingInk" xmlns:wps="http://schemas.microsoft.com/office/word/2010/wordprocessingShape" mc:Ignorable="w14 wp14">
-  <w:p>
-    <w:pPr>
-      <w:pStyle w:val="Footer"/>
-    </w:pPr>
+    <w:fldSimple w:instr="PAGE"/>
   </w:p>
 </w:ftr>
 </file>
@@ -2098,36 +2069,6 @@
     </w:p>
   </w:footnote>
 </w:footnotes>
-</file>
-
-<file path=word/header1.xml><?xml version="1.0" encoding="utf-8"?>
-<w:hdr xmlns:m="http://schemas.openxmlformats.org/officeDocument/2006/math" xmlns:mc="http://schemas.openxmlformats.org/markup-compatibility/2006" xmlns:mo="http://schemas.microsoft.com/office/mac/office/2008/main" xmlns:mv="urn:schemas-microsoft-com:mac:vml" xmlns:o="urn:schemas-microsoft-com:office:office" xmlns:r="http://schemas.openxmlformats.org/officeDocument/2006/relationships" xmlns:v="urn:schemas-microsoft-com:vml" xmlns:w10="urn:schemas-microsoft-com:office:word" xmlns:w14="http://schemas.microsoft.com/office/word/2010/wordml" xmlns:w="http://schemas.openxmlformats.org/wordprocessingml/2006/main" xmlns:wne="http://schemas.microsoft.com/office/word/2006/wordml" xmlns:wp14="http://schemas.microsoft.com/office/word/2010/wordprocessingDrawing" xmlns:wp="http://schemas.openxmlformats.org/drawingml/2006/wordprocessingDrawing" xmlns:wpc="http://schemas.microsoft.com/office/word/2010/wordprocessingCanvas" xmlns:wpg="http://schemas.microsoft.com/office/word/2010/wordprocessingGroup" xmlns:wpi="http://schemas.microsoft.com/office/word/2010/wordprocessingInk" xmlns:wps="http://schemas.microsoft.com/office/word/2010/wordprocessingShape" mc:Ignorable="w14 wp14">
-  <w:p>
-    <w:pPr>
-      <w:pStyle w:val="Header"/>
-    </w:pPr>
-  </w:p>
-</w:hdr>
-</file>
-
-<file path=word/header2.xml><?xml version="1.0" encoding="utf-8"?>
-<w:hdr xmlns:m="http://schemas.openxmlformats.org/officeDocument/2006/math" xmlns:mc="http://schemas.openxmlformats.org/markup-compatibility/2006" xmlns:mo="http://schemas.microsoft.com/office/mac/office/2008/main" xmlns:mv="urn:schemas-microsoft-com:mac:vml" xmlns:o="urn:schemas-microsoft-com:office:office" xmlns:r="http://schemas.openxmlformats.org/officeDocument/2006/relationships" xmlns:v="urn:schemas-microsoft-com:vml" xmlns:w10="urn:schemas-microsoft-com:office:word" xmlns:w14="http://schemas.microsoft.com/office/word/2010/wordml" xmlns:w="http://schemas.openxmlformats.org/wordprocessingml/2006/main" xmlns:wne="http://schemas.microsoft.com/office/word/2006/wordml" xmlns:wp14="http://schemas.microsoft.com/office/word/2010/wordprocessingDrawing" xmlns:wp="http://schemas.openxmlformats.org/drawingml/2006/wordprocessingDrawing" xmlns:wpc="http://schemas.microsoft.com/office/word/2010/wordprocessingCanvas" xmlns:wpg="http://schemas.microsoft.com/office/word/2010/wordprocessingGroup" xmlns:wpi="http://schemas.microsoft.com/office/word/2010/wordprocessingInk" xmlns:wps="http://schemas.microsoft.com/office/word/2010/wordprocessingShape" mc:Ignorable="w14 wp14">
-  <w:p>
-    <w:pPr>
-      <w:pStyle w:val="Header"/>
-    </w:pPr>
-  </w:p>
-</w:hdr>
-</file>
-
-<file path=word/header3.xml><?xml version="1.0" encoding="utf-8"?>
-<w:hdr xmlns:m="http://schemas.openxmlformats.org/officeDocument/2006/math" xmlns:mc="http://schemas.openxmlformats.org/markup-compatibility/2006" xmlns:mo="http://schemas.microsoft.com/office/mac/office/2008/main" xmlns:mv="urn:schemas-microsoft-com:mac:vml" xmlns:o="urn:schemas-microsoft-com:office:office" xmlns:r="http://schemas.openxmlformats.org/officeDocument/2006/relationships" xmlns:v="urn:schemas-microsoft-com:vml" xmlns:w10="urn:schemas-microsoft-com:office:word" xmlns:w14="http://schemas.microsoft.com/office/word/2010/wordml" xmlns:w="http://schemas.openxmlformats.org/wordprocessingml/2006/main" xmlns:wne="http://schemas.microsoft.com/office/word/2006/wordml" xmlns:wp14="http://schemas.microsoft.com/office/word/2010/wordprocessingDrawing" xmlns:wp="http://schemas.openxmlformats.org/drawingml/2006/wordprocessingDrawing" xmlns:wpc="http://schemas.microsoft.com/office/word/2010/wordprocessingCanvas" xmlns:wpg="http://schemas.microsoft.com/office/word/2010/wordprocessingGroup" xmlns:wpi="http://schemas.microsoft.com/office/word/2010/wordprocessingInk" xmlns:wps="http://schemas.microsoft.com/office/word/2010/wordprocessingShape" mc:Ignorable="w14 wp14">
-  <w:p>
-    <w:pPr>
-      <w:pStyle w:val="Header"/>
-    </w:pPr>
-  </w:p>
-</w:hdr>
 </file>
 
 <file path=word/numbering.xml><?xml version="1.0" encoding="utf-8"?>
@@ -2823,8 +2764,11 @@
     <w:name w:val="Normal"/>
     <w:qFormat/>
     <w:rsid w:val="00FC693F"/>
+    <w:pPr>
+      <w:spacing w:after="80" w:line="254" w:lineRule="auto"/>
+    </w:pPr>
     <w:rPr>
-      <w:rFonts w:ascii="Aptos" w:hAnsi="Aptos"/>
+      <w:rFonts w:ascii="Arial" w:eastAsia="Arial" w:hAnsi="Arial"/>
       <w:sz w:val="21"/>
     </w:rPr>
   </w:style>
@@ -2864,6 +2808,10 @@
       </w:tabs>
       <w:spacing w:after="0" w:line="240" w:lineRule="auto"/>
     </w:pPr>
+    <w:rPr>
+      <w:rFonts w:ascii="Arial" w:eastAsia="Arial" w:hAnsi="Arial"/>
+      <w:sz w:val="17"/>
+    </w:rPr>
   </w:style>
   <w:style w:customStyle="1" w:styleId="FooterChar" w:type="character">
     <w:name w:val="Footer Char"/>
@@ -2883,11 +2831,11 @@
     <w:pPr>
       <w:keepNext/>
       <w:keepLines/>
-      <w:spacing w:after="0" w:before="480"/>
+      <w:spacing w:after="100" w:before="200"/>
       <w:outlineLvl w:val="0"/>
     </w:pPr>
     <w:rPr>
-      <w:rFonts w:ascii="Aptos" w:asciiTheme="majorHAnsi" w:cstheme="majorBidi" w:eastAsiaTheme="majorEastAsia" w:hAnsi="Aptos" w:hAnsiTheme="majorHAnsi"/>
+      <w:rFonts w:ascii="Arial" w:asciiTheme="majorHAnsi" w:cstheme="majorBidi" w:eastAsia="Arial" w:eastAsiaTheme="majorEastAsia" w:hAnsi="Arial" w:hAnsiTheme="majorHAnsi"/>
       <w:b/>
       <w:bCs/>
       <w:color w:themeColor="accent1" w:themeShade="BF" w:val="365F91"/>
@@ -2907,11 +2855,11 @@
     <w:pPr>
       <w:keepNext/>
       <w:keepLines/>
-      <w:spacing w:after="0" w:before="200"/>
+      <w:spacing w:after="80" w:before="180"/>
       <w:outlineLvl w:val="1"/>
     </w:pPr>
     <w:rPr>
-      <w:rFonts w:ascii="Aptos" w:asciiTheme="majorHAnsi" w:cstheme="majorBidi" w:eastAsiaTheme="majorEastAsia" w:hAnsi="Aptos" w:hAnsiTheme="majorHAnsi"/>
+      <w:rFonts w:ascii="Arial" w:asciiTheme="majorHAnsi" w:cstheme="majorBidi" w:eastAsia="Arial" w:eastAsiaTheme="majorEastAsia" w:hAnsi="Arial" w:hAnsiTheme="majorHAnsi"/>
       <w:b/>
       <w:bCs/>
       <w:color w:themeColor="accent1" w:val="4F81BD"/>
@@ -2931,15 +2879,15 @@
     <w:pPr>
       <w:keepNext/>
       <w:keepLines/>
-      <w:spacing w:after="0" w:before="200"/>
+      <w:spacing w:after="60" w:before="140"/>
       <w:outlineLvl w:val="2"/>
     </w:pPr>
     <w:rPr>
-      <w:rFonts w:ascii="Aptos" w:asciiTheme="majorHAnsi" w:cstheme="majorBidi" w:eastAsiaTheme="majorEastAsia" w:hAnsi="Aptos" w:hAnsiTheme="majorHAnsi"/>
+      <w:rFonts w:ascii="Arial" w:asciiTheme="majorHAnsi" w:cstheme="majorBidi" w:eastAsia="Arial" w:eastAsiaTheme="majorEastAsia" w:hAnsi="Arial" w:hAnsiTheme="majorHAnsi"/>
       <w:b/>
       <w:bCs/>
       <w:color w:themeColor="accent1" w:val="4F81BD"/>
-      <w:sz w:val="22"/>
+      <w:sz w:val="23"/>
     </w:rPr>
   </w:style>
   <w:style w:styleId="Heading4" w:type="paragraph">
@@ -2959,12 +2907,13 @@
       <w:outlineLvl w:val="3"/>
     </w:pPr>
     <w:rPr>
-      <w:rFonts w:asciiTheme="majorHAnsi" w:cstheme="majorBidi" w:eastAsiaTheme="majorEastAsia" w:hAnsiTheme="majorHAnsi"/>
+      <w:rFonts w:ascii="Arial" w:asciiTheme="majorHAnsi" w:cstheme="majorBidi" w:eastAsia="Arial" w:eastAsiaTheme="majorEastAsia" w:hAnsi="Arial" w:hAnsiTheme="majorHAnsi"/>
       <w:b/>
       <w:bCs/>
       <w:i/>
       <w:iCs/>
       <w:color w:themeColor="accent1" w:val="4F81BD"/>
+      <w:sz w:val="21"/>
     </w:rPr>
   </w:style>
   <w:style w:styleId="Heading5" w:type="paragraph">
@@ -3177,11 +3126,12 @@
       <w:contextualSpacing/>
     </w:pPr>
     <w:rPr>
-      <w:rFonts w:ascii="Aptos" w:asciiTheme="majorHAnsi" w:cstheme="majorBidi" w:eastAsiaTheme="majorEastAsia" w:hAnsi="Aptos" w:hAnsiTheme="majorHAnsi"/>
+      <w:rFonts w:ascii="Arial" w:asciiTheme="majorHAnsi" w:cstheme="majorBidi" w:eastAsia="Arial" w:eastAsiaTheme="majorEastAsia" w:hAnsi="Arial" w:hAnsiTheme="majorHAnsi"/>
+      <w:b/>
       <w:color w:themeColor="text2" w:themeShade="BF" w:val="17365D"/>
       <w:spacing w:val="5"/>
       <w:kern w:val="28"/>
-      <w:sz w:val="48"/>
+      <w:sz w:val="38"/>
       <w:szCs w:val="52"/>
     </w:rPr>
   </w:style>
@@ -3214,12 +3164,13 @@
       </w:numPr>
     </w:pPr>
     <w:rPr>
-      <w:rFonts w:asciiTheme="majorHAnsi" w:cstheme="majorBidi" w:eastAsiaTheme="majorEastAsia" w:hAnsiTheme="majorHAnsi"/>
+      <w:rFonts w:ascii="Arial" w:asciiTheme="majorHAnsi" w:cstheme="majorBidi" w:eastAsia="Arial" w:eastAsiaTheme="majorEastAsia" w:hAnsi="Arial" w:hAnsiTheme="majorHAnsi"/>
+      <w:b w:val="0"/>
       <w:i/>
       <w:iCs/>
       <w:color w:themeColor="accent1" w:val="4F81BD"/>
       <w:spacing w:val="15"/>
-      <w:sz w:val="24"/>
+      <w:sz w:val="22"/>
       <w:szCs w:val="24"/>
     </w:rPr>
   </w:style>

</xml_diff>

<commit_message>
docs: corrigir gerador e regenerar entregáveis normativos v5
</commit_message>
<xml_diff>
--- a/Documentos/Anexo_Modelo_Fisico_Jornada_v1.40.docx
+++ b/Documentos/Anexo_Modelo_Fisico_Jornada_v1.40.docx
@@ -144,7 +144,7 @@
       <w:r>
         <w:drawing>
           <wp:inline>
-            <wp:extent cx="8412480" cy="5013579"/>
+            <wp:extent cx="8412480" cy="5040183"/>
             <wp:effectExtent b="0" l="0" r="0" t="0"/>
             <wp:docPr descr="Figura 1 - Diagrama de classes UML da estrutura de Identidade/Linkage" title="" id="21" name="Picture"/>
             <a:graphic>
@@ -165,7 +165,7 @@
                   <pic:spPr bwMode="auto">
                     <a:xfrm>
                       <a:off x="0" y="0"/>
-                      <a:ext cx="8412480" cy="5013579"/>
+                      <a:ext cx="8412480" cy="5040183"/>
                     </a:xfrm>
                     <a:prstGeom prst="rect">
                       <a:avLst/>
@@ -383,6 +383,30 @@
         <w:t xml:space="preserve">exige Base Normativa 3.62, SolutionSchema 3.70 e os objetos operacionais essenciais da identidade progressiva, composição e Linkage. Uma instalação parcial não pode ser declarada pronta.</w:t>
       </w:r>
     </w:p>
+    <w:p>
+      <w:pPr>
+        <w:pStyle w:val="BodyText"/>
+      </w:pPr>
+      <w:r>
+        <w:t xml:space="preserve">O mesmo contrato relacional canônico pode ser homologado em</w:t>
+      </w:r>
+      <w:r>
+        <w:t xml:space="preserve"> </w:t>
+      </w:r>
+      <w:r>
+        <w:rPr>
+          <w:bCs/>
+          <w:b/>
+        </w:rPr>
+        <w:t xml:space="preserve">SQL Database in Microsoft Fabric</w:t>
+      </w:r>
+      <w:r>
+        <w:t xml:space="preserve"> </w:t>
+      </w:r>
+      <w:r>
+        <w:t xml:space="preserve">para HML/Produção. Essa hospedagem não cria uma segunda definição do modelo físico nem autoriza DDL divergente: o baseline independente de ambiente permanece o SQL Server 2022 exercitado em DEV/CI, e qualquer diferença de compatibilidade deve falhar explicitamente ou ser tratada por mudança versionada do contrato comum.</w:t>
+      </w:r>
+    </w:p>
     <w:bookmarkEnd w:id="28"/>
     <w:bookmarkStart w:id="29" w:name="inventário-medido"/>
     <w:p>
@@ -1918,7 +1942,7 @@
         <w:pStyle w:val="Compact"/>
       </w:pPr>
       <w:r>
-        <w:t xml:space="preserve">Microsoft SQL Server permanece a tecnologia relacional normativa.</w:t>
+        <w:t xml:space="preserve">Microsoft SQL Server permanece a tecnologia relacional normativa e o baseline independente de ambiente do contrato relacional.</w:t>
       </w:r>
     </w:p>
     <w:p>
@@ -1993,7 +2017,11 @@
         <w:pStyle w:val="Compact"/>
       </w:pPr>
       <w:r>
-        <w:t xml:space="preserve">Fabric permanece no escopo analítico/compatibilidade definido pela arquitetura.</w:t>
+        <w:rPr>
+          <w:bCs/>
+          <w:b/>
+        </w:rPr>
+        <w:t xml:space="preserve">SQL Database in Microsoft Fabric pode hospedar o banco relacional operacional de HML/Produção quando homologado para a release exata, usando o mesmo contrato Microsoft SQL; Lakehouse e SQL Analytics Endpoint permanecem analíticos/compatibilidade e não são fonte de verdade operacional implícita.</w:t>
       </w:r>
     </w:p>
     <w:p>

</xml_diff>